<commit_message>
EHP submission: B/W figures, expand abbreviations, add model df, repo URL, generic cover letter
Co-Authored-By: Tatsuki Onishi <bougtoir@gmail.com>
</commit_message>
<xml_diff>
--- a/heat_accidents_mortality/output/manuscript/cover_letter.docx
+++ b/heat_accidents_mortality/output/manuscript/cover_letter.docx
@@ -15,7 +15,7 @@
         <w:spacing w:after="120" w:line="480" w:lineRule="auto"/>
       </w:pPr>
       <w:r>
-        <w:t>The Editors, The Lancet Planetary Health</w:t>
+        <w:t>The Editor-in-Chief, [Target journal]</w:t>
       </w:r>
     </w:p>
     <w:p>
@@ -31,7 +31,7 @@
         <w:spacing w:after="120" w:line="480" w:lineRule="auto"/>
       </w:pPr>
       <w:r>
-        <w:t>We submit for your consideration our manuscript, “Ambient heat as an under-recognised risk factor for US traffic-crash mortality: a distributed-lag analysis with an exploratory Japan comparison”, as an Article.</w:t>
+        <w:t>We submit for your consideration our manuscript, “Ambient heat as an under-recognised risk factor for US traffic-crash mortality: a distributed-lag analysis with road-safety implications”, as a Research Article.</w:t>
       </w:r>
     </w:p>
     <w:p>
@@ -39,7 +39,7 @@
         <w:spacing w:after="120" w:line="480" w:lineRule="auto"/>
       </w:pPr>
       <w:r>
-        <w:t>Using only public data, this ecological, population-level study shows that days hotter than the local seasonal norm carry an acute excess of US traffic-crash deaths that survives adjustment for national driving activity, is concentrated in heat-exposed open-air road users, and is comparable in magnitude to all officially recorded direct-heat deaths — a burden that would be invisible to routine cause-of-death surveillance and that our scenario projections suggest would grow under warming. We believe this speaks directly to the journal's focus on the health consequences of climate change and on under-recognised planetary-health burdens.</w:t>
+        <w:t>Using only public data, this ecological, population-level study shows that days hotter than the local seasonal norm carry an acute excess of US traffic-crash deaths that survives adjustment for national driving activity, is concentrated in heat-exposed open-air road users, and is comparable in magnitude to all officially recorded direct-heat deaths — a burden that would be invisible to routine cause-of-death surveillance and that our scenario projections suggest would grow under warming. We believe this speaks directly to the journal's focus on the environmental determinants of health and on under-recognised climate-sensitive mortality burdens.</w:t>
       </w:r>
     </w:p>
     <w:p>

</xml_diff>